<commit_message>
Add Lab 4 - CSS Layout (Flexbox, Grid, Position) and update Lab 3
</commit_message>
<xml_diff>
--- a/LAB-3/Web-Engineering-Lab-3.docx
+++ b/LAB-3/Web-Engineering-Lab-3.docx
@@ -23,20 +23,7 @@
           <w:szCs w:val="40"/>
           <w:lang w:val="en-US"/>
         </w:rPr>
-        <w:t>WEB-EN</w:t>
-      </w:r>
-      <w:bookmarkStart w:id="0" w:name="_GoBack"/>
-      <w:bookmarkEnd w:id="0"/>
-      <w:r>
-        <w:rPr>
-          <w:rFonts w:hint="eastAsia" w:ascii="SimSun" w:hAnsi="SimSun" w:eastAsia="SimSun" w:cs="SimSun"/>
-          <w:b/>
-          <w:bCs/>
-          <w:sz w:val="40"/>
-          <w:szCs w:val="40"/>
-          <w:lang w:val="en-US"/>
-        </w:rPr>
-        <w:t>GINEERING-LAB-3</w:t>
+        <w:t>WEB-ENGINEERING-LAB-3</w:t>
       </w:r>
     </w:p>
     <w:p>
@@ -166,64 +153,8 @@
           <w:szCs w:val="24"/>
         </w:rPr>
       </w:pPr>
-    </w:p>
-    <w:p>
-      <w:pPr>
-        <w:jc w:val="both"/>
-        <w:rPr>
-          <w:rFonts w:hint="eastAsia" w:ascii="SimSun" w:hAnsi="SimSun" w:eastAsia="SimSun" w:cs="SimSun"/>
-          <w:sz w:val="24"/>
-          <w:szCs w:val="24"/>
-        </w:rPr>
-      </w:pPr>
-      <w:r>
-        <w:rPr>
-          <w:rFonts w:hint="eastAsia" w:ascii="SimSun" w:hAnsi="SimSun" w:eastAsia="SimSun" w:cs="SimSun"/>
-          <w:sz w:val="24"/>
-          <w:szCs w:val="24"/>
-        </w:rPr>
-        <w:drawing>
-          <wp:inline distT="0" distB="0" distL="114300" distR="114300">
-            <wp:extent cx="5261610" cy="2889885"/>
-            <wp:effectExtent l="0" t="0" r="11430" b="5715"/>
-            <wp:docPr id="2" name="Picture 2"/>
-            <wp:cNvGraphicFramePr>
-              <a:graphicFrameLocks xmlns:a="http://schemas.openxmlformats.org/drawingml/2006/main" noChangeAspect="1"/>
-            </wp:cNvGraphicFramePr>
-            <a:graphic xmlns:a="http://schemas.openxmlformats.org/drawingml/2006/main">
-              <a:graphicData uri="http://schemas.openxmlformats.org/drawingml/2006/picture">
-                <pic:pic xmlns:pic="http://schemas.openxmlformats.org/drawingml/2006/picture">
-                  <pic:nvPicPr>
-                    <pic:cNvPr id="2" name="Picture 2"/>
-                    <pic:cNvPicPr>
-                      <a:picLocks noChangeAspect="1"/>
-                    </pic:cNvPicPr>
-                  </pic:nvPicPr>
-                  <pic:blipFill>
-                    <a:blip r:embed="rId5"/>
-                    <a:stretch>
-                      <a:fillRect/>
-                    </a:stretch>
-                  </pic:blipFill>
-                  <pic:spPr>
-                    <a:xfrm>
-                      <a:off x="0" y="0"/>
-                      <a:ext cx="5261610" cy="2889885"/>
-                    </a:xfrm>
-                    <a:prstGeom prst="rect">
-                      <a:avLst/>
-                    </a:prstGeom>
-                    <a:noFill/>
-                    <a:ln>
-                      <a:noFill/>
-                    </a:ln>
-                  </pic:spPr>
-                </pic:pic>
-              </a:graphicData>
-            </a:graphic>
-          </wp:inline>
-        </w:drawing>
-      </w:r>
+      <w:bookmarkStart w:id="0" w:name="_GoBack"/>
+      <w:bookmarkEnd w:id="0"/>
     </w:p>
     <w:p>
       <w:pPr>
@@ -335,7 +266,7 @@
                     </pic:cNvPicPr>
                   </pic:nvPicPr>
                   <pic:blipFill>
-                    <a:blip r:embed="rId6"/>
+                    <a:blip r:embed="rId5"/>
                     <a:stretch>
                       <a:fillRect/>
                     </a:stretch>
@@ -403,7 +334,7 @@
                     </pic:cNvPicPr>
                   </pic:nvPicPr>
                   <pic:blipFill>
-                    <a:blip r:embed="rId7"/>
+                    <a:blip r:embed="rId6"/>
                     <a:stretch>
                       <a:fillRect/>
                     </a:stretch>
@@ -535,7 +466,7 @@
                     </pic:cNvPicPr>
                   </pic:nvPicPr>
                   <pic:blipFill>
-                    <a:blip r:embed="rId8"/>
+                    <a:blip r:embed="rId7"/>
                     <a:stretch>
                       <a:fillRect/>
                     </a:stretch>
@@ -613,7 +544,7 @@
                     </pic:cNvPicPr>
                   </pic:nvPicPr>
                   <pic:blipFill>
-                    <a:blip r:embed="rId9"/>
+                    <a:blip r:embed="rId8"/>
                     <a:stretch>
                       <a:fillRect/>
                     </a:stretch>
@@ -859,7 +790,7 @@
                     </pic:cNvPicPr>
                   </pic:nvPicPr>
                   <pic:blipFill>
-                    <a:blip r:embed="rId10"/>
+                    <a:blip r:embed="rId9"/>
                     <a:stretch>
                       <a:fillRect/>
                     </a:stretch>
@@ -936,6 +867,7 @@
     <w:p>
       <w:pPr>
         <w:numPr>
+          <w:ilvl w:val="0"/>
           <w:numId w:val="0"/>
         </w:numPr>
         <w:jc w:val="both"/>
@@ -952,6 +884,7 @@
     <w:p>
       <w:pPr>
         <w:numPr>
+          <w:ilvl w:val="0"/>
           <w:numId w:val="0"/>
         </w:numPr>
         <w:jc w:val="both"/>
@@ -985,7 +918,7 @@
                     </pic:cNvPicPr>
                   </pic:nvPicPr>
                   <pic:blipFill>
-                    <a:blip r:embed="rId11"/>
+                    <a:blip r:embed="rId10"/>
                     <a:stretch>
                       <a:fillRect/>
                     </a:stretch>
@@ -1013,6 +946,7 @@
     <w:p>
       <w:pPr>
         <w:numPr>
+          <w:ilvl w:val="0"/>
           <w:numId w:val="0"/>
         </w:numPr>
         <w:jc w:val="both"/>
@@ -1061,6 +995,7 @@
         <w:keepLines w:val="0"/>
         <w:widowControl/>
         <w:numPr>
+          <w:ilvl w:val="0"/>
           <w:numId w:val="0"/>
         </w:numPr>
         <w:suppressLineNumbers w:val="0"/>
@@ -1146,7 +1081,7 @@
                     </pic:cNvPicPr>
                   </pic:nvPicPr>
                   <pic:blipFill>
-                    <a:blip r:embed="rId10"/>
+                    <a:blip r:embed="rId9"/>
                     <a:stretch>
                       <a:fillRect/>
                     </a:stretch>
@@ -1447,7 +1382,7 @@
                     </pic:cNvPicPr>
                   </pic:nvPicPr>
                   <pic:blipFill>
-                    <a:blip r:embed="rId12"/>
+                    <a:blip r:embed="rId11"/>
                     <a:stretch>
                       <a:fillRect/>
                     </a:stretch>
@@ -1543,7 +1478,17 @@
           <w:sz w:val="24"/>
           <w:szCs w:val="24"/>
         </w:rPr>
-        <w:t>·</w:t>
+        <w:t xml:space="preserve">· </w:t>
+      </w:r>
+      <w:r>
+        <w:rPr>
+          <w:rFonts w:hint="eastAsia" w:ascii="SimSun" w:hAnsi="SimSun" w:eastAsia="SimSun" w:cs="SimSun"/>
+          <w:b/>
+          <w:bCs/>
+          <w:sz w:val="24"/>
+          <w:szCs w:val="24"/>
+        </w:rPr>
+        <w:t>Winner:</w:t>
       </w:r>
       <w:r>
         <w:rPr>
@@ -1555,24 +1500,6 @@
       </w:r>
       <w:r>
         <w:rPr>
-          <w:rFonts w:hint="eastAsia" w:ascii="SimSun" w:hAnsi="SimSun" w:eastAsia="SimSun" w:cs="SimSun"/>
-          <w:b/>
-          <w:bCs/>
-          <w:sz w:val="24"/>
-          <w:szCs w:val="24"/>
-        </w:rPr>
-        <w:t>Winner:</w:t>
-      </w:r>
-      <w:r>
-        <w:rPr>
-          <w:rFonts w:hint="eastAsia" w:ascii="SimSun" w:hAnsi="SimSun" w:eastAsia="SimSun" w:cs="SimSun"/>
-          <w:sz w:val="24"/>
-          <w:szCs w:val="24"/>
-        </w:rPr>
-        <w:t xml:space="preserve"> </w:t>
-      </w:r>
-      <w:r>
-        <w:rPr>
           <w:rStyle w:val="4"/>
           <w:rFonts w:hint="eastAsia" w:ascii="SimSun" w:hAnsi="SimSun" w:eastAsia="SimSun" w:cs="SimSun"/>
           <w:sz w:val="24"/>
@@ -1609,15 +1536,7 @@
           <w:sz w:val="24"/>
           <w:szCs w:val="24"/>
         </w:rPr>
-        <w:t>·</w:t>
-      </w:r>
-      <w:r>
-        <w:rPr>
-          <w:rFonts w:hint="eastAsia" w:ascii="SimSun" w:hAnsi="SimSun" w:eastAsia="SimSun" w:cs="SimSun"/>
-          <w:sz w:val="24"/>
-          <w:szCs w:val="24"/>
-        </w:rPr>
-        <w:t xml:space="preserve"> </w:t>
+        <w:t xml:space="preserve">· </w:t>
       </w:r>
       <w:r>
         <w:rPr>
@@ -1801,7 +1720,7 @@
                     </pic:cNvPicPr>
                   </pic:nvPicPr>
                   <pic:blipFill>
-                    <a:blip r:embed="rId13"/>
+                    <a:blip r:embed="rId12"/>
                     <a:stretch>
                       <a:fillRect/>
                     </a:stretch>
@@ -1897,15 +1816,7 @@
           <w:sz w:val="24"/>
           <w:szCs w:val="24"/>
         </w:rPr>
-        <w:t>·</w:t>
-      </w:r>
-      <w:r>
-        <w:rPr>
-          <w:rFonts w:hint="eastAsia" w:ascii="SimSun" w:hAnsi="SimSun" w:eastAsia="SimSun" w:cs="SimSun"/>
-          <w:sz w:val="24"/>
-          <w:szCs w:val="24"/>
-        </w:rPr>
-        <w:t xml:space="preserve">  </w:t>
+        <w:t xml:space="preserve">·  </w:t>
       </w:r>
       <w:r>
         <w:rPr>
@@ -1962,15 +1873,7 @@
           <w:sz w:val="24"/>
           <w:szCs w:val="24"/>
         </w:rPr>
-        <w:t>·</w:t>
-      </w:r>
-      <w:r>
-        <w:rPr>
-          <w:rFonts w:hint="eastAsia" w:ascii="SimSun" w:hAnsi="SimSun" w:eastAsia="SimSun" w:cs="SimSun"/>
-          <w:sz w:val="24"/>
-          <w:szCs w:val="24"/>
-        </w:rPr>
-        <w:t xml:space="preserve">  </w:t>
+        <w:t xml:space="preserve">·  </w:t>
       </w:r>
       <w:r>
         <w:rPr>
@@ -2130,7 +2033,7 @@
                     </pic:cNvPicPr>
                   </pic:nvPicPr>
                   <pic:blipFill>
-                    <a:blip r:embed="rId14"/>
+                    <a:blip r:embed="rId13"/>
                     <a:stretch>
                       <a:fillRect/>
                     </a:stretch>
@@ -2226,15 +2129,7 @@
           <w:sz w:val="24"/>
           <w:szCs w:val="24"/>
         </w:rPr>
-        <w:t>·</w:t>
-      </w:r>
-      <w:r>
-        <w:rPr>
-          <w:rFonts w:hint="eastAsia" w:ascii="SimSun" w:hAnsi="SimSun" w:eastAsia="SimSun" w:cs="SimSun"/>
-          <w:sz w:val="24"/>
-          <w:szCs w:val="24"/>
-        </w:rPr>
-        <w:t xml:space="preserve">  </w:t>
+        <w:t xml:space="preserve">·  </w:t>
       </w:r>
       <w:r>
         <w:rPr>
@@ -2291,15 +2186,7 @@
           <w:sz w:val="24"/>
           <w:szCs w:val="24"/>
         </w:rPr>
-        <w:t>·</w:t>
-      </w:r>
-      <w:r>
-        <w:rPr>
-          <w:rFonts w:hint="eastAsia" w:ascii="SimSun" w:hAnsi="SimSun" w:eastAsia="SimSun" w:cs="SimSun"/>
-          <w:sz w:val="24"/>
-          <w:szCs w:val="24"/>
-        </w:rPr>
-        <w:t xml:space="preserve">  </w:t>
+        <w:t xml:space="preserve">·  </w:t>
       </w:r>
       <w:r>
         <w:rPr>
@@ -2388,7 +2275,7 @@
                     </pic:cNvPicPr>
                   </pic:nvPicPr>
                   <pic:blipFill>
-                    <a:blip r:embed="rId15"/>
+                    <a:blip r:embed="rId14"/>
                     <a:stretch>
                       <a:fillRect/>
                     </a:stretch>
@@ -2470,15 +2357,7 @@
           <w:sz w:val="24"/>
           <w:szCs w:val="24"/>
         </w:rPr>
-        <w:t>·</w:t>
-      </w:r>
-      <w:r>
-        <w:rPr>
-          <w:rFonts w:hint="eastAsia" w:ascii="SimSun" w:hAnsi="SimSun" w:eastAsia="SimSun" w:cs="SimSun"/>
-          <w:sz w:val="24"/>
-          <w:szCs w:val="24"/>
-        </w:rPr>
-        <w:t xml:space="preserve">  </w:t>
+        <w:t xml:space="preserve">·  </w:t>
       </w:r>
       <w:r>
         <w:rPr>
@@ -2535,15 +2414,7 @@
           <w:sz w:val="24"/>
           <w:szCs w:val="24"/>
         </w:rPr>
-        <w:t>·</w:t>
-      </w:r>
-      <w:r>
-        <w:rPr>
-          <w:rFonts w:hint="eastAsia" w:ascii="SimSun" w:hAnsi="SimSun" w:eastAsia="SimSun" w:cs="SimSun"/>
-          <w:sz w:val="24"/>
-          <w:szCs w:val="24"/>
-        </w:rPr>
-        <w:t xml:space="preserve">  </w:t>
+        <w:t xml:space="preserve">·  </w:t>
       </w:r>
       <w:r>
         <w:rPr>
@@ -2618,7 +2489,7 @@
                     </pic:cNvPicPr>
                   </pic:nvPicPr>
                   <pic:blipFill>
-                    <a:blip r:embed="rId16"/>
+                    <a:blip r:embed="rId15"/>
                     <a:stretch>
                       <a:fillRect/>
                     </a:stretch>
@@ -2769,6 +2640,7 @@
     <w:p>
       <w:pPr>
         <w:numPr>
+          <w:ilvl w:val="0"/>
           <w:numId w:val="0"/>
         </w:numPr>
         <w:jc w:val="both"/>
@@ -2783,6 +2655,7 @@
     <w:p>
       <w:pPr>
         <w:numPr>
+          <w:ilvl w:val="0"/>
           <w:numId w:val="0"/>
         </w:numPr>
         <w:jc w:val="both"/>
@@ -2797,6 +2670,7 @@
     <w:p>
       <w:pPr>
         <w:numPr>
+          <w:ilvl w:val="0"/>
           <w:numId w:val="0"/>
         </w:numPr>
         <w:jc w:val="both"/>
@@ -3184,6 +3058,7 @@
       <w:jc w:val="left"/>
     </w:pPr>
     <w:rPr>
+      <w:rFonts w:ascii="Times New Roman" w:hAnsi="Times New Roman" w:eastAsia="SimSun" w:cs="Times New Roman"/>
       <w:kern w:val="0"/>
       <w:sz w:val="24"/>
       <w:szCs w:val="24"/>

</xml_diff>